<commit_message>
Update Rueckkehr audio delivery files
</commit_message>
<xml_diff>
--- a/die-rueckkehr-zum-ursprung/downloads/Die_Rueckkehr_zum_Ursprung_Produktseitentexte.docx
+++ b/die-rueckkehr-zum-ursprung/downloads/Die_Rueckkehr_zum_Ursprung_Produktseitentexte.docx
@@ -383,7 +383,7 @@
                 <w:color w:val="111111"/>
                 <w:sz w:val="22"/>
               </w:rPr>
-              <w:t>77:18 Min.</w:t>
+              <w:t>72:00 Min.</w:t>
             </w:r>
           </w:p>
           <w:p>
@@ -776,7 +776,7 @@
         <w:spacing w:after="120"/>
       </w:pPr>
       <w:r>
-        <w:t>MUSIK · STIMME · NATURKLÄNGE · RESONANZSTRUKTUREN</w:t>
+        <w:t>MUSIK · STIMME · SOLO-CELLO · NATURKLÄNGE · RESONANZSTRUKTUREN</w:t>
       </w:r>
     </w:p>
     <w:p>
@@ -799,7 +799,7 @@
           <w:color w:val="2A2D2F"/>
           <w:sz w:val="22"/>
         </w:rPr>
-        <w:t>Simon Fox hat die Musik eigens für diese Reise aus realen Audio-Loops gestaltet. Instrumentale Drones, menschliche Stimmen und Klänge analoger Synthesizer verbinden sich mit akustischen Aufnahmen von Wind in einem Wald zu einer kontinuierlichen Klanglandschaft.</w:t>
+        <w:t>Simon Fox hat die Musik eigens für diese Reise aus realen Audio-Loops gestaltet. Instrumentale Drones, menschliche Stimmen und Klänge analoger Synthesizer verbinden sich mit live eingespieltem Solo-Cello und akustischen Aufnahmen von Wind in einem Wald zu einer kontinuierlichen Klanglandschaft.</w:t>
       </w:r>
     </w:p>
     <w:p>
@@ -824,8 +824,8 @@
       <w:r>
         <w:drawing>
           <wp:inline xmlns:a="http://schemas.openxmlformats.org/drawingml/2006/main" xmlns:pic="http://schemas.openxmlformats.org/drawingml/2006/picture">
-            <wp:extent cx="5897880" cy="2190258"/>
-            <wp:docPr id="3" name="Picture 3" descr="Diagramm der Klangarchitektur mit Musik, Stimme, Naturklängen, Fractal Noise und Frequenzbeziehungen"/>
+            <wp:extent cx="5897880" cy="2192045"/>
+            <wp:docPr id="3" name="Picture 3" descr="Diagramm der Klangarchitektur mit Musik und Solo-Cello, Stimme, Naturklängen, Fractal Noise und Frequenzbeziehungen"/>
             <wp:cNvGraphicFramePr>
               <a:graphicFrameLocks noChangeAspect="1"/>
             </wp:cNvGraphicFramePr>
@@ -845,7 +845,7 @@
                   <pic:spPr>
                     <a:xfrm>
                       <a:off x="0" y="0"/>
-                      <a:ext cx="5897880" cy="2190258"/>
+                      <a:ext cx="5897880" cy="2192045"/>
                     </a:xfrm>
                     <a:prstGeom prst="rect"/>
                   </pic:spPr>
@@ -1278,7 +1278,7 @@
               </w:rPr>
               <w:t>Rückkehr zum Ursprung – mit Führung</w:t>
               <w:br/>
-              <w:t>38:41 Min. · mit Dieter Broers’ Sprechstimme</w:t>
+              <w:t>36:03 Min. · mit Dieter Broers’ Sprechstimme</w:t>
             </w:r>
           </w:p>
         </w:tc>
@@ -1335,7 +1335,7 @@
               </w:rPr>
               <w:t>Rückkehr zum Ursprung – ohne Führung</w:t>
               <w:br/>
-              <w:t>38:34 Min. · Musik- und Resonanzfassung ohne Sprache</w:t>
+              <w:t>35:57 Min. · Musik- und Resonanzfassung ohne Sprache</w:t>
             </w:r>
           </w:p>
         </w:tc>
@@ -1390,7 +1390,7 @@
                 <w:color w:val="2A2D2F"/>
                 <w:sz w:val="19"/>
               </w:rPr>
-              <w:t>77:18 Min.</w:t>
+              <w:t>72:00 Min.</w:t>
             </w:r>
           </w:p>
         </w:tc>
@@ -1524,6 +1524,30 @@
           <w:color w:val="848A8F"/>
           <w:sz w:val="16"/>
         </w:rPr>
+        <w:t>SOLO-CELLO</w:t>
+        <w:br/>
+      </w:r>
+      <w:r>
+        <w:rPr>
+          <w:rFonts w:ascii="Arial" w:hAnsi="Arial"/>
+          <w:b/>
+          <w:color w:val="111111"/>
+          <w:sz w:val="22"/>
+        </w:rPr>
+        <w:t>Simon Fox</w:t>
+      </w:r>
+    </w:p>
+    <w:p>
+      <w:pPr>
+        <w:spacing w:after="100"/>
+      </w:pPr>
+      <w:r>
+        <w:rPr>
+          <w:rFonts w:ascii="Arial" w:hAnsi="Arial"/>
+          <w:b/>
+          <w:color w:val="848A8F"/>
+          <w:sz w:val="16"/>
+        </w:rPr>
         <w:t>REDAKTION</w:t>
         <w:br/>
       </w:r>
@@ -1580,9 +1604,9 @@
                 <w:color w:val="2A2D2F"/>
                 <w:sz w:val="19"/>
               </w:rPr>
-              <w:t>REDAKTIONELLER PRÜFPUNKT VOR VERÖFFENTLICHUNG</w:t>
+              <w:t>LIZENZHINWEIS</w:t>
               <w:br/>
-              <w:t>Nach Abschluss der Lizenzvereinbarung lautet der vorgesehene Credit: „Enthält lizenzierte Klänge von: Stéphane Pigeon“.</w:t>
+              <w:t>Enthält lizenzierte Klänge: © Stéphane Pigeon.</w:t>
             </w:r>
           </w:p>
         </w:tc>
@@ -1677,7 +1701,7 @@
           <w:color w:val="2A2D2F"/>
           <w:sz w:val="22"/>
         </w:rPr>
-        <w:t>Dieter Broers’ Stimme verbindet sich mit einer eigens für diese Reise gestalteten Klanglandschaft aus instrumentalen Drones, menschlichen Stimmen, analogen Synthesizerklängen und Aufnahmen von Wind in einem Wald. Ein tief eingebettetes Fractal-Noise-Resonanzsignal sowie organisch in die Musik integrierte Frequenzbeziehungen bilden weitere Ebenen der Klangarchitektur.</w:t>
+        <w:t>Dieter Broers’ Stimme verbindet sich mit einer eigens für diese Reise gestalteten Klanglandschaft aus instrumentalen Drones, menschlichen Stimmen, analogen Synthesizerklängen, live eingespieltem Solo-Cello und Aufnahmen von Wind in einem Wald. Ein tief eingebettetes Fractal-Noise-Resonanzsignal sowie organisch in die Musik integrierte Frequenzbeziehungen bilden weitere Ebenen der Klangarchitektur.</w:t>
       </w:r>
     </w:p>
     <w:p>
@@ -1715,7 +1739,7 @@
         <w:pStyle w:val="BulletBrand"/>
       </w:pPr>
       <w:r>
-        <w:t>Gesamtlaufzeit: 77:18 Minuten</w:t>
+        <w:t>Gesamtlaufzeit: 72:00 Minuten</w:t>
       </w:r>
     </w:p>
     <w:p>
@@ -1749,14 +1773,6 @@
       </w:pPr>
       <w:r>
         <w:t>Artikelnummer, ISBN und endgültiger Umfang des Booklets, sofern relevant</w:t>
-      </w:r>
-    </w:p>
-    <w:p>
-      <w:pPr>
-        <w:pStyle w:val="BulletBrand"/>
-      </w:pPr>
-      <w:r>
-        <w:t>Finaler Lizenzstatus und Credit für Stéphane Pigeon</w:t>
       </w:r>
     </w:p>
     <w:p>
@@ -1853,7 +1869,7 @@
               <w:color w:val="848A8F"/>
               <w:sz w:val="16"/>
             </w:rPr>
-            <w:t>DIE RÜCKKEHR ZUM URSPRUNG  ·  STAND 16.08.2026</w:t>
+            <w:t>DIE RÜCKKEHR ZUM URSPRUNG  ·  STAND 18.08.2026</w:t>
           </w:r>
         </w:p>
       </w:tc>
@@ -1939,7 +1955,7 @@
               <w:color w:val="848A8F"/>
               <w:sz w:val="16"/>
             </w:rPr>
-            <w:t>DIE RÜCKKEHR ZUM URSPRUNG  ·  STAND 16.08.2026</w:t>
+            <w:t>DIE RÜCKKEHR ZUM URSPRUNG  ·  STAND 18.08.2026</w:t>
           </w:r>
         </w:p>
       </w:tc>

</xml_diff>